<commit_message>
refactor: unify tc/tr access pattern to dot notation i.field_name
Template: change hardcoded yes to {{ i.field }}, remove extra column, fix cell drift. Excel: add 9 approval fields per project. Preprocessor: clear tc end cell before append. 91 tests pass.
</commit_message>
<xml_diff>
--- a/templates/尽调报告模板v1.docx
+++ b/templates/尽调报告模板v1.docx
@@ -450,7 +450,13 @@
           </w:tcPr>
           <w:p>
             <w:r>
-              <w:t>{%tr for i in 释义 %}</w:t>
+              <w:t xml:space="preserve">{%tr for i in </w:t>
+            </w:r>
+            <w:r>
+              <w:t>释义</w:t>
+            </w:r>
+            <w:r>
+              <w:t xml:space="preserve"> %}</w:t>
             </w:r>
           </w:p>
         </w:tc>
@@ -4015,7 +4021,6 @@
         <w:ind w:left="0" w:firstLineChars="200" w:firstLine="422"/>
         <w:outlineLvl w:val="2"/>
         <w:rPr>
-          <w:rFonts w:hint="eastAsia"/>
           <w:b/>
           <w:snapToGrid w:val="0"/>
           <w:szCs w:val="21"/>
@@ -5516,7 +5521,19 @@
           </w:tcPr>
           <w:p>
             <w:r>
-              <w:t>{%tr for i in 历史沿革.股权结构 %}</w:t>
+              <w:t xml:space="preserve">{%tr for i in </w:t>
+            </w:r>
+            <w:r>
+              <w:t>历史沿革</w:t>
+            </w:r>
+            <w:r>
+              <w:t>.</w:t>
+            </w:r>
+            <w:r>
+              <w:t>股权结构</w:t>
+            </w:r>
+            <w:r>
+              <w:t xml:space="preserve"> %}</w:t>
             </w:r>
           </w:p>
         </w:tc>
@@ -6052,7 +6069,6 @@
         <w:adjustRightInd w:val="0"/>
         <w:snapToGrid w:val="0"/>
         <w:rPr>
-          <w:rFonts w:hint="eastAsia"/>
           <w:szCs w:val="24"/>
           <w:lang w:val="en-GB"/>
         </w:rPr>
@@ -6096,7 +6112,6 @@
         <w:snapToGrid w:val="0"/>
         <w:outlineLvl w:val="3"/>
         <w:rPr>
-          <w:rFonts w:hint="eastAsia"/>
           <w:szCs w:val="21"/>
           <w:lang w:val="en-GB"/>
         </w:rPr>
@@ -6121,7 +6136,79 @@
         </w:rPr>
       </w:pPr>
       <w:r>
-        <w:t>公司系由{{ 历史沿革.设立公司 }}出资组建，于{{ 历史沿革.设立日期 | date }}取得{{ 历史沿革.设立工商局}}核发的、统一社会信用代码为{{ 历史沿革.统一社会信用代码 }}的企业法人营业执照。设立时股权结构如下：</w:t>
+        <w:t>公司系由</w:t>
+      </w:r>
+      <w:r>
+        <w:t xml:space="preserve">{{ </w:t>
+      </w:r>
+      <w:r>
+        <w:t>历史沿革</w:t>
+      </w:r>
+      <w:r>
+        <w:t>.</w:t>
+      </w:r>
+      <w:r>
+        <w:t>设立公司</w:t>
+      </w:r>
+      <w:r>
+        <w:t xml:space="preserve"> }}</w:t>
+      </w:r>
+      <w:r>
+        <w:t>出资组建，于</w:t>
+      </w:r>
+      <w:r>
+        <w:t xml:space="preserve">{{ </w:t>
+      </w:r>
+      <w:r>
+        <w:t>历史沿革</w:t>
+      </w:r>
+      <w:r>
+        <w:t>.</w:t>
+      </w:r>
+      <w:r>
+        <w:t>设立日期</w:t>
+      </w:r>
+      <w:r>
+        <w:t xml:space="preserve"> | date }}</w:t>
+      </w:r>
+      <w:r>
+        <w:t>取得</w:t>
+      </w:r>
+      <w:r>
+        <w:t xml:space="preserve">{{ </w:t>
+      </w:r>
+      <w:r>
+        <w:t>历史沿革</w:t>
+      </w:r>
+      <w:r>
+        <w:t>.</w:t>
+      </w:r>
+      <w:r>
+        <w:t>设立工商局</w:t>
+      </w:r>
+      <w:r>
+        <w:t>}}</w:t>
+      </w:r>
+      <w:r>
+        <w:t>核发的、统一社会信用代码为</w:t>
+      </w:r>
+      <w:r>
+        <w:t xml:space="preserve">{{ </w:t>
+      </w:r>
+      <w:r>
+        <w:t>历史沿革</w:t>
+      </w:r>
+      <w:r>
+        <w:t>.</w:t>
+      </w:r>
+      <w:r>
+        <w:t>统一社会信用代码</w:t>
+      </w:r>
+      <w:r>
+        <w:t xml:space="preserve"> }}</w:t>
+      </w:r>
+      <w:r>
+        <w:t>的企业法人营业执照。设立时股权结构如下：</w:t>
       </w:r>
     </w:p>
     <w:tbl>
@@ -6370,7 +6457,19 @@
           </w:tcPr>
           <w:p>
             <w:r>
-              <w:t>{%tr for i in 历史沿革.公司设立 %}</w:t>
+              <w:t xml:space="preserve">{%tr for i in </w:t>
+            </w:r>
+            <w:r>
+              <w:t>历史沿革</w:t>
+            </w:r>
+            <w:r>
+              <w:t>.</w:t>
+            </w:r>
+            <w:r>
+              <w:t>公司设立</w:t>
+            </w:r>
+            <w:r>
+              <w:t xml:space="preserve"> %}</w:t>
             </w:r>
           </w:p>
         </w:tc>
@@ -6795,6 +6894,7 @@
                 <w:sz w:val="18"/>
                 <w:szCs w:val="20"/>
               </w:rPr>
+              <w:lastRenderedPageBreak/>
               <w:t xml:space="preserve">{%tr </w:t>
             </w:r>
             <w:proofErr w:type="spellStart"/>
@@ -6911,21 +7011,21 @@
           <w:rFonts w:ascii="Times New Roman" w:hAnsi="Times New Roman"/>
         </w:rPr>
       </w:pPr>
-      <w:bookmarkStart w:id="107" w:name="_Toc493514358"/>
-      <w:bookmarkStart w:id="108" w:name="_Toc141985850"/>
-      <w:bookmarkStart w:id="109" w:name="_Toc1986796"/>
-      <w:bookmarkStart w:id="110" w:name="_Toc214712261"/>
+      <w:bookmarkStart w:id="107" w:name="_Toc141985850"/>
+      <w:bookmarkStart w:id="108" w:name="_Toc1986796"/>
+      <w:bookmarkStart w:id="109" w:name="_Toc214712261"/>
+      <w:bookmarkStart w:id="110" w:name="_Toc493514358"/>
       <w:r>
         <w:rPr>
           <w:rFonts w:ascii="Times New Roman" w:hAnsi="Times New Roman"/>
         </w:rPr>
         <w:t>项目的基本情况</w:t>
       </w:r>
+      <w:bookmarkEnd w:id="107"/>
       <w:bookmarkEnd w:id="108"/>
       <w:bookmarkEnd w:id="109"/>
-      <w:bookmarkEnd w:id="110"/>
     </w:p>
-    <w:bookmarkEnd w:id="107"/>
+    <w:bookmarkEnd w:id="110"/>
     <w:p>
       <w:pPr>
         <w:widowControl w:val="0"/>
@@ -6944,7 +7044,12 @@
         </w:rPr>
       </w:pPr>
       <w:r>
-        <w:t>项目概况{% for i in 项目基本情况.项目公司 %}</w:t>
+        <w:rPr>
+          <w:b/>
+          <w:snapToGrid w:val="0"/>
+          <w:szCs w:val="21"/>
+        </w:rPr>
+        <w:t>项目概况</w:t>
       </w:r>
     </w:p>
     <w:p>
@@ -6963,7 +7068,7 @@
           <w:szCs w:val="21"/>
           <w:lang w:val="en-GB"/>
         </w:rPr>
-        <w:t xml:space="preserve">{{ </w:t>
+        <w:t xml:space="preserve">{% for i in 项目基本情况 %}{{ i.项目名称 }}位于{{ i.项目地址 }}，实际装机容量为{{ i.项目装机量 }}，采用“{{ i.项目模式 }}”运行方式。</w:t>
       </w:r>
       <w:proofErr w:type="spellStart"/>
       <w:r>
@@ -6972,15 +7077,23 @@
           <w:szCs w:val="21"/>
           <w:lang w:val="en-GB"/>
         </w:rPr>
-        <w:t>i</w:t>
+        <w:t/>
       </w:r>
       <w:proofErr w:type="spellEnd"/>
       <w:r>
         <w:rPr>
+          <w:rFonts w:hint="eastAsia"/>
           <w:szCs w:val="21"/>
           <w:lang w:val="en-GB"/>
         </w:rPr>
-        <w:t>.</w:t>
+        <w:t xml:space="preserve"/>
+      </w:r>
+      <w:r>
+        <w:rPr>
+          <w:szCs w:val="21"/>
+          <w:lang w:val="en-GB"/>
+        </w:rPr>
+        <w:t xml:space="preserve"/>
       </w:r>
       <w:r>
         <w:rPr>
@@ -6988,36 +7101,89 @@
           <w:szCs w:val="21"/>
           <w:lang w:val="en-GB"/>
         </w:rPr>
-        <w:t>项目名称</w:t>
+        <w:t/>
       </w:r>
       <w:r>
         <w:rPr>
           <w:szCs w:val="21"/>
           <w:lang w:val="en-GB"/>
         </w:rPr>
-        <w:t xml:space="preserve"> }}</w:t>
+        <w:t/>
       </w:r>
       <w:r>
         <w:rPr>
           <w:szCs w:val="21"/>
           <w:lang w:val="en-GB"/>
         </w:rPr>
-        <w:t>位于</w:t>
+        <w:t/>
       </w:r>
       <w:r>
         <w:rPr>
           <w:szCs w:val="21"/>
           <w:lang w:val="en-GB"/>
         </w:rPr>
-        <w:t>{{</w:t>
-      </w:r>
+        <w:t xml:space="preserve"/>
+      </w:r>
+      <w:r>
+        <w:rPr>
+          <w:szCs w:val="21"/>
+          <w:lang w:val="en-GB"/>
+        </w:rPr>
+        <w:t xml:space="preserve"/>
+      </w:r>
+      <w:proofErr w:type="spellStart"/>
       <w:r>
         <w:rPr>
           <w:rFonts w:hint="eastAsia"/>
           <w:szCs w:val="21"/>
           <w:lang w:val="en-GB"/>
         </w:rPr>
-        <w:t xml:space="preserve"> </w:t>
+        <w:t/>
+      </w:r>
+      <w:proofErr w:type="spellEnd"/>
+      <w:r>
+        <w:rPr>
+          <w:szCs w:val="21"/>
+          <w:lang w:val="en-GB"/>
+        </w:rPr>
+        <w:t/>
+      </w:r>
+      <w:r>
+        <w:rPr>
+          <w:rFonts w:hint="eastAsia"/>
+          <w:szCs w:val="21"/>
+          <w:lang w:val="en-GB"/>
+        </w:rPr>
+        <w:t/>
+      </w:r>
+      <w:r>
+        <w:rPr>
+          <w:szCs w:val="21"/>
+          <w:lang w:val="en-GB"/>
+        </w:rPr>
+        <w:t xml:space="preserve"/>
+      </w:r>
+      <w:r>
+        <w:rPr>
+          <w:szCs w:val="21"/>
+          <w:lang w:val="en-GB"/>
+        </w:rPr>
+        <w:t/>
+      </w:r>
+      <w:r>
+        <w:rPr>
+          <w:szCs w:val="21"/>
+          <w:lang w:val="en-GB"/>
+        </w:rPr>
+        <w:t/>
+      </w:r>
+      <w:r>
+        <w:rPr>
+          <w:rFonts w:hint="eastAsia"/>
+          <w:szCs w:val="21"/>
+          <w:lang w:val="en-GB"/>
+        </w:rPr>
+        <w:t xml:space="preserve"/>
       </w:r>
       <w:proofErr w:type="spellStart"/>
       <w:r>
@@ -7026,7 +7192,7 @@
           <w:szCs w:val="21"/>
           <w:lang w:val="en-GB"/>
         </w:rPr>
-        <w:t>i</w:t>
+        <w:t/>
       </w:r>
       <w:proofErr w:type="spellEnd"/>
       <w:r>
@@ -7034,14 +7200,14 @@
           <w:szCs w:val="21"/>
           <w:lang w:val="en-GB"/>
         </w:rPr>
-        <w:t>.</w:t>
+        <w:t/>
       </w:r>
       <w:r>
         <w:rPr>
           <w:szCs w:val="21"/>
           <w:lang w:val="en-GB"/>
         </w:rPr>
-        <w:t>项目</w:t>
+        <w:t/>
       </w:r>
       <w:r>
         <w:rPr>
@@ -7049,27 +7215,27 @@
           <w:szCs w:val="21"/>
           <w:lang w:val="en-GB"/>
         </w:rPr>
-        <w:t>地址</w:t>
+        <w:t/>
       </w:r>
       <w:r>
         <w:rPr>
           <w:szCs w:val="21"/>
           <w:lang w:val="en-GB"/>
         </w:rPr>
-        <w:t xml:space="preserve"> }}</w:t>
+        <w:t xml:space="preserve"/>
       </w:r>
       <w:r>
         <w:rPr>
           <w:szCs w:val="21"/>
           <w:lang w:val="en-GB"/>
         </w:rPr>
-        <w:t>，实际装机容量为</w:t>
-      </w:r>
-      <w:r>
-        <w:rPr>
-          <w:szCs w:val="21"/>
-        </w:rPr>
-        <w:t xml:space="preserve">{{ </w:t>
+        <w:t/>
+      </w:r>
+      <w:r>
+        <w:rPr>
+          <w:szCs w:val="21"/>
+        </w:rPr>
+        <w:t xml:space="preserve"/>
       </w:r>
       <w:proofErr w:type="spellStart"/>
       <w:r>
@@ -7078,7 +7244,7 @@
           <w:szCs w:val="21"/>
           <w:lang w:val="en-GB"/>
         </w:rPr>
-        <w:t>i</w:t>
+        <w:t/>
       </w:r>
       <w:proofErr w:type="spellEnd"/>
       <w:r>
@@ -7086,47 +7252,47 @@
           <w:szCs w:val="21"/>
           <w:lang w:val="en-GB"/>
         </w:rPr>
-        <w:t>.</w:t>
-      </w:r>
-      <w:r>
-        <w:rPr>
-          <w:szCs w:val="21"/>
-        </w:rPr>
-        <w:t>项目</w:t>
+        <w:t/>
+      </w:r>
+      <w:r>
+        <w:rPr>
+          <w:szCs w:val="21"/>
+        </w:rPr>
+        <w:t/>
       </w:r>
       <w:r>
         <w:rPr>
           <w:rFonts w:hint="eastAsia"/>
           <w:szCs w:val="21"/>
         </w:rPr>
-        <w:t>装机量</w:t>
-      </w:r>
-      <w:r>
-        <w:rPr>
-          <w:szCs w:val="21"/>
-        </w:rPr>
-        <w:t xml:space="preserve"> }}</w:t>
+        <w:t/>
+      </w:r>
+      <w:r>
+        <w:rPr>
+          <w:szCs w:val="21"/>
+        </w:rPr>
+        <w:t xml:space="preserve"/>
       </w:r>
       <w:r>
         <w:rPr>
           <w:szCs w:val="21"/>
           <w:lang w:val="en-GB"/>
         </w:rPr>
-        <w:t>，采用</w:t>
+        <w:t/>
       </w:r>
       <w:r>
         <w:rPr>
           <w:szCs w:val="21"/>
           <w:lang w:val="en-GB"/>
         </w:rPr>
-        <w:t>“</w:t>
+        <w:t/>
       </w:r>
       <w:r>
         <w:rPr>
           <w:szCs w:val="21"/>
           <w:lang w:val="en-GB"/>
         </w:rPr>
-        <w:t xml:space="preserve">{{ </w:t>
+        <w:t xml:space="preserve"/>
       </w:r>
       <w:proofErr w:type="spellStart"/>
       <w:r>
@@ -7135,7 +7301,7 @@
           <w:szCs w:val="21"/>
           <w:lang w:val="en-GB"/>
         </w:rPr>
-        <w:t>i</w:t>
+        <w:t/>
       </w:r>
       <w:proofErr w:type="spellEnd"/>
       <w:r>
@@ -7143,7 +7309,7 @@
           <w:szCs w:val="21"/>
           <w:lang w:val="en-GB"/>
         </w:rPr>
-        <w:t>.</w:t>
+        <w:t/>
       </w:r>
       <w:r>
         <w:rPr>
@@ -7151,28 +7317,63 @@
           <w:szCs w:val="21"/>
           <w:lang w:val="en-GB"/>
         </w:rPr>
-        <w:t>项目模式</w:t>
+        <w:t/>
       </w:r>
       <w:r>
         <w:rPr>
           <w:szCs w:val="21"/>
           <w:lang w:val="en-GB"/>
         </w:rPr>
-        <w:t xml:space="preserve"> }}</w:t>
+        <w:t xml:space="preserve"/>
       </w:r>
       <w:r>
         <w:rPr>
           <w:szCs w:val="21"/>
           <w:lang w:val="en-GB"/>
         </w:rPr>
-        <w:t>”</w:t>
+        <w:t/>
       </w:r>
       <w:r>
         <w:rPr>
           <w:szCs w:val="21"/>
           <w:lang w:val="en-GB"/>
         </w:rPr>
-        <w:t>运行方式。</w:t>
+        <w:t/>
+      </w:r>
+    </w:p>
+    <w:p>
+      <w:pPr>
+        <w:widowControl w:val="0"/>
+        <w:adjustRightInd w:val="0"/>
+        <w:snapToGrid w:val="0"/>
+        <w:ind w:firstLineChars="200" w:firstLine="420"/>
+        <w:rPr>
+          <w:szCs w:val="21"/>
+          <w:lang w:val="en-GB"/>
+        </w:rPr>
+      </w:pPr>
+      <w:r>
+        <w:rPr>
+          <w:szCs w:val="21"/>
+          <w:lang w:val="en-GB"/>
+        </w:rPr>
+        <w:t xml:space="preserve">{% </w:t>
+      </w:r>
+      <w:proofErr w:type="spellStart"/>
+      <w:r>
+        <w:rPr>
+          <w:szCs w:val="21"/>
+          <w:lang w:val="en-GB"/>
+        </w:rPr>
+        <w:t>endfor</w:t>
+      </w:r>
+      <w:proofErr w:type="spellEnd"/>
+      <w:r>
+        <w:rPr>
+          <w:szCs w:val="21"/>
+          <w:lang w:val="en-GB"/>
+        </w:rPr>
+        <w:t xml:space="preserve"> %}</w:t>
       </w:r>
     </w:p>
     <w:p>
@@ -7193,7 +7394,12 @@
         </w:rPr>
       </w:pPr>
       <w:r>
-        <w:t>{% endfor %}项目总投资{% for i in 项目基本情况.项目公司 %}</w:t>
+        <w:rPr>
+          <w:b/>
+          <w:snapToGrid w:val="0"/>
+          <w:szCs w:val="21"/>
+        </w:rPr>
+        <w:t>项目总投资</w:t>
       </w:r>
     </w:p>
     <w:p>
@@ -7204,14 +7410,15 @@
         <w:ind w:firstLineChars="200" w:firstLine="420"/>
         <w:rPr>
           <w:szCs w:val="21"/>
-        </w:rPr>
-      </w:pPr>
-      <w:r>
-        <w:rPr>
-          <w:szCs w:val="21"/>
           <w:lang w:val="en-GB"/>
         </w:rPr>
-        <w:t xml:space="preserve">{{ </w:t>
+      </w:pPr>
+      <w:r>
+        <w:rPr>
+          <w:szCs w:val="21"/>
+          <w:lang w:val="en-GB"/>
+        </w:rPr>
+        <w:t xml:space="preserve">{% for i in 项目基本情况 %}{{ i.项目名称 }}项目竣工安装容量为{{ i.项目装机量 }}，含税工程总价为{{ i.含税总价 | money }}元，含税建设单价为{{ i.含税单价 | money }}元/Wp。</w:t>
       </w:r>
       <w:proofErr w:type="spellStart"/>
       <w:r>
@@ -7219,7 +7426,7 @@
           <w:szCs w:val="21"/>
           <w:lang w:val="en-GB"/>
         </w:rPr>
-        <w:t>i</w:t>
+        <w:t/>
       </w:r>
       <w:proofErr w:type="spellEnd"/>
       <w:r>
@@ -7227,40 +7434,42 @@
           <w:szCs w:val="21"/>
           <w:lang w:val="en-GB"/>
         </w:rPr>
-        <w:t>.</w:t>
+        <w:t xml:space="preserve"/>
       </w:r>
       <w:r>
         <w:rPr>
           <w:szCs w:val="21"/>
           <w:lang w:val="en-GB"/>
         </w:rPr>
-        <w:t>项目名称</w:t>
+        <w:t/>
       </w:r>
       <w:r>
         <w:rPr>
           <w:szCs w:val="21"/>
           <w:lang w:val="en-GB"/>
         </w:rPr>
-        <w:t xml:space="preserve"> }}</w:t>
+        <w:t/>
       </w:r>
       <w:r>
         <w:rPr>
           <w:szCs w:val="21"/>
           <w:lang w:val="en-GB"/>
         </w:rPr>
-        <w:t>项目</w:t>
-      </w:r>
-      <w:r>
-        <w:rPr>
-          <w:szCs w:val="21"/>
-        </w:rPr>
-        <w:t>竣工安装容量为</w:t>
-      </w:r>
-      <w:r>
-        <w:rPr>
-          <w:szCs w:val="21"/>
-        </w:rPr>
-        <w:t xml:space="preserve">{{ </w:t>
+        <w:t/>
+      </w:r>
+      <w:r>
+        <w:rPr>
+          <w:szCs w:val="21"/>
+          <w:lang w:val="en-GB"/>
+        </w:rPr>
+        <w:t xml:space="preserve"/>
+      </w:r>
+      <w:r>
+        <w:rPr>
+          <w:szCs w:val="21"/>
+          <w:lang w:val="en-GB"/>
+        </w:rPr>
+        <w:t xml:space="preserve"/>
       </w:r>
       <w:proofErr w:type="spellStart"/>
       <w:r>
@@ -7268,7 +7477,7 @@
           <w:szCs w:val="21"/>
           <w:lang w:val="en-GB"/>
         </w:rPr>
-        <w:t>i</w:t>
+        <w:t/>
       </w:r>
       <w:proofErr w:type="spellEnd"/>
       <w:r>
@@ -7276,31 +7485,40 @@
           <w:szCs w:val="21"/>
           <w:lang w:val="en-GB"/>
         </w:rPr>
-        <w:t>.</w:t>
-      </w:r>
-      <w:r>
-        <w:rPr>
-          <w:szCs w:val="21"/>
-        </w:rPr>
-        <w:t>项目装机量</w:t>
-      </w:r>
-      <w:r>
-        <w:rPr>
-          <w:szCs w:val="21"/>
-        </w:rPr>
-        <w:t xml:space="preserve"> }}</w:t>
-      </w:r>
-      <w:r>
-        <w:rPr>
-          <w:szCs w:val="21"/>
-        </w:rPr>
-        <w:t>，含税工程总价为</w:t>
-      </w:r>
-      <w:r>
-        <w:rPr>
-          <w:szCs w:val="21"/>
-        </w:rPr>
-        <w:t xml:space="preserve">{{ </w:t>
+        <w:t/>
+      </w:r>
+      <w:r>
+        <w:rPr>
+          <w:szCs w:val="21"/>
+          <w:lang w:val="en-GB"/>
+        </w:rPr>
+        <w:t/>
+      </w:r>
+      <w:r>
+        <w:rPr>
+          <w:szCs w:val="21"/>
+          <w:lang w:val="en-GB"/>
+        </w:rPr>
+        <w:t xml:space="preserve"/>
+      </w:r>
+      <w:r>
+        <w:rPr>
+          <w:szCs w:val="21"/>
+          <w:lang w:val="en-GB"/>
+        </w:rPr>
+        <w:t/>
+      </w:r>
+      <w:r>
+        <w:rPr>
+          <w:szCs w:val="21"/>
+        </w:rPr>
+        <w:t/>
+      </w:r>
+      <w:r>
+        <w:rPr>
+          <w:szCs w:val="21"/>
+        </w:rPr>
+        <w:t xml:space="preserve"/>
       </w:r>
       <w:proofErr w:type="spellStart"/>
       <w:r>
@@ -7308,7 +7526,7 @@
           <w:szCs w:val="21"/>
           <w:lang w:val="en-GB"/>
         </w:rPr>
-        <w:t>i</w:t>
+        <w:t/>
       </w:r>
       <w:proofErr w:type="spellEnd"/>
       <w:r>
@@ -7316,39 +7534,79 @@
           <w:szCs w:val="21"/>
           <w:lang w:val="en-GB"/>
         </w:rPr>
-        <w:t>.</w:t>
+        <w:t/>
+      </w:r>
+      <w:r>
+        <w:rPr>
+          <w:szCs w:val="21"/>
+        </w:rPr>
+        <w:t/>
+      </w:r>
+      <w:r>
+        <w:rPr>
+          <w:szCs w:val="21"/>
+        </w:rPr>
+        <w:t xml:space="preserve"/>
+      </w:r>
+      <w:r>
+        <w:rPr>
+          <w:szCs w:val="21"/>
+        </w:rPr>
+        <w:t/>
+      </w:r>
+      <w:r>
+        <w:rPr>
+          <w:szCs w:val="21"/>
+        </w:rPr>
+        <w:t xml:space="preserve"/>
+      </w:r>
+      <w:proofErr w:type="spellStart"/>
+      <w:r>
+        <w:rPr>
+          <w:szCs w:val="21"/>
+          <w:lang w:val="en-GB"/>
+        </w:rPr>
+        <w:t/>
+      </w:r>
+      <w:proofErr w:type="spellEnd"/>
+      <w:r>
+        <w:rPr>
+          <w:szCs w:val="21"/>
+          <w:lang w:val="en-GB"/>
+        </w:rPr>
+        <w:t/>
       </w:r>
       <w:r>
         <w:rPr>
           <w:rFonts w:hint="eastAsia"/>
           <w:szCs w:val="21"/>
         </w:rPr>
-        <w:t>含税总价</w:t>
+        <w:t/>
       </w:r>
       <w:r>
         <w:rPr>
           <w:rFonts w:hint="eastAsia"/>
           <w:szCs w:val="21"/>
         </w:rPr>
-        <w:t xml:space="preserve"> | money</w:t>
-      </w:r>
-      <w:r>
-        <w:rPr>
-          <w:szCs w:val="21"/>
-        </w:rPr>
-        <w:t xml:space="preserve"> }}</w:t>
-      </w:r>
-      <w:r>
-        <w:rPr>
-          <w:szCs w:val="21"/>
-        </w:rPr>
-        <w:t>元，含税建设单价为</w:t>
-      </w:r>
-      <w:r>
-        <w:rPr>
-          <w:szCs w:val="21"/>
-        </w:rPr>
-        <w:t xml:space="preserve">{{ </w:t>
+        <w:t xml:space="preserve"/>
+      </w:r>
+      <w:r>
+        <w:rPr>
+          <w:szCs w:val="21"/>
+        </w:rPr>
+        <w:t xml:space="preserve"/>
+      </w:r>
+      <w:r>
+        <w:rPr>
+          <w:szCs w:val="21"/>
+        </w:rPr>
+        <w:t/>
+      </w:r>
+      <w:r>
+        <w:rPr>
+          <w:szCs w:val="21"/>
+        </w:rPr>
+        <w:t xml:space="preserve"/>
       </w:r>
       <w:proofErr w:type="spellStart"/>
       <w:r>
@@ -7356,7 +7614,7 @@
           <w:szCs w:val="21"/>
           <w:lang w:val="en-GB"/>
         </w:rPr>
-        <w:t>i</w:t>
+        <w:t/>
       </w:r>
       <w:proofErr w:type="spellEnd"/>
       <w:r>
@@ -7364,27 +7622,27 @@
           <w:szCs w:val="21"/>
           <w:lang w:val="en-GB"/>
         </w:rPr>
-        <w:t>.</w:t>
-      </w:r>
-      <w:r>
-        <w:rPr>
-          <w:szCs w:val="21"/>
-        </w:rPr>
-        <w:t>含</w:t>
+        <w:t/>
+      </w:r>
+      <w:r>
+        <w:rPr>
+          <w:szCs w:val="21"/>
+        </w:rPr>
+        <w:t/>
       </w:r>
       <w:proofErr w:type="gramStart"/>
       <w:r>
         <w:rPr>
           <w:szCs w:val="21"/>
         </w:rPr>
-        <w:t>税</w:t>
+        <w:t/>
       </w:r>
       <w:r>
         <w:rPr>
           <w:rFonts w:hint="eastAsia"/>
           <w:szCs w:val="21"/>
         </w:rPr>
-        <w:t>单价</w:t>
+        <w:t/>
       </w:r>
       <w:proofErr w:type="gramEnd"/>
       <w:r>
@@ -7392,38 +7650,66 @@
           <w:rFonts w:hint="eastAsia"/>
           <w:szCs w:val="21"/>
         </w:rPr>
-        <w:t xml:space="preserve"> </w:t>
-      </w:r>
-      <w:r>
-        <w:rPr>
-          <w:rFonts w:hint="eastAsia"/>
-          <w:szCs w:val="21"/>
-        </w:rPr>
-        <w:t>| money</w:t>
-      </w:r>
-      <w:r>
-        <w:rPr>
-          <w:szCs w:val="21"/>
-        </w:rPr>
-        <w:t xml:space="preserve"> }}</w:t>
-      </w:r>
-      <w:r>
-        <w:rPr>
-          <w:szCs w:val="21"/>
-        </w:rPr>
-        <w:t>元</w:t>
-      </w:r>
-      <w:r>
-        <w:rPr>
-          <w:szCs w:val="21"/>
-        </w:rPr>
-        <w:t>/Wp</w:t>
-      </w:r>
-      <w:r>
-        <w:rPr>
-          <w:szCs w:val="21"/>
-        </w:rPr>
-        <w:t>。</w:t>
+        <w:t xml:space="preserve"/>
+      </w:r>
+      <w:r>
+        <w:rPr>
+          <w:szCs w:val="21"/>
+        </w:rPr>
+        <w:t xml:space="preserve"/>
+      </w:r>
+      <w:r>
+        <w:rPr>
+          <w:szCs w:val="21"/>
+        </w:rPr>
+        <w:t/>
+      </w:r>
+      <w:r>
+        <w:rPr>
+          <w:szCs w:val="21"/>
+        </w:rPr>
+        <w:t/>
+      </w:r>
+      <w:r>
+        <w:rPr>
+          <w:szCs w:val="21"/>
+        </w:rPr>
+        <w:t/>
+      </w:r>
+    </w:p>
+    <w:p>
+      <w:pPr>
+        <w:widowControl w:val="0"/>
+        <w:adjustRightInd w:val="0"/>
+        <w:snapToGrid w:val="0"/>
+        <w:ind w:firstLineChars="200" w:firstLine="420"/>
+        <w:rPr>
+          <w:szCs w:val="21"/>
+          <w:lang w:val="en-GB"/>
+        </w:rPr>
+      </w:pPr>
+      <w:r>
+        <w:rPr>
+          <w:szCs w:val="21"/>
+          <w:lang w:val="en-GB"/>
+        </w:rPr>
+        <w:t xml:space="preserve">{% </w:t>
+      </w:r>
+      <w:proofErr w:type="spellStart"/>
+      <w:r>
+        <w:rPr>
+          <w:szCs w:val="21"/>
+          <w:lang w:val="en-GB"/>
+        </w:rPr>
+        <w:t>endfor</w:t>
+      </w:r>
+      <w:proofErr w:type="spellEnd"/>
+      <w:r>
+        <w:rPr>
+          <w:szCs w:val="21"/>
+          <w:lang w:val="en-GB"/>
+        </w:rPr>
+        <w:t xml:space="preserve"> %}</w:t>
       </w:r>
     </w:p>
     <w:p>
@@ -7444,7 +7730,12 @@
         </w:rPr>
       </w:pPr>
       <w:r>
-        <w:t>{% endfor %}项目相关手续办理情况</w:t>
+        <w:rPr>
+          <w:b/>
+          <w:snapToGrid w:val="0"/>
+          <w:szCs w:val="21"/>
+        </w:rPr>
+        <w:t>项目相关手续办理情况</w:t>
       </w:r>
     </w:p>
     <w:tbl>
@@ -7565,7 +7856,7 @@
                 <w:sz w:val="18"/>
                 <w:szCs w:val="18"/>
               </w:rPr>
-              <w:t>{%</w:t>
+              <w:t>{%tc for i in 项目基本情况%}</w:t>
             </w:r>
             <w:proofErr w:type="spellStart"/>
             <w:r>
@@ -7575,7 +7866,7 @@
                 <w:sz w:val="18"/>
                 <w:szCs w:val="18"/>
               </w:rPr>
-              <w:t>tc</w:t>
+              <w:t/>
             </w:r>
             <w:proofErr w:type="spellEnd"/>
             <w:r>
@@ -7585,7 +7876,7 @@
                 <w:sz w:val="18"/>
                 <w:szCs w:val="18"/>
               </w:rPr>
-              <w:t xml:space="preserve"> for </w:t>
+              <w:t xml:space="preserve"/>
             </w:r>
             <w:proofErr w:type="spellStart"/>
             <w:r>
@@ -7595,7 +7886,7 @@
                 <w:sz w:val="18"/>
                 <w:szCs w:val="18"/>
               </w:rPr>
-              <w:t>i</w:t>
+              <w:t/>
             </w:r>
             <w:proofErr w:type="spellEnd"/>
             <w:r>
@@ -7605,7 +7896,7 @@
                 <w:sz w:val="18"/>
                 <w:szCs w:val="18"/>
               </w:rPr>
-              <w:t xml:space="preserve"> in </w:t>
+              <w:t xml:space="preserve"/>
             </w:r>
             <w:r>
               <w:rPr>
@@ -7614,7 +7905,7 @@
                 <w:sz w:val="18"/>
                 <w:szCs w:val="18"/>
               </w:rPr>
-              <w:t>项目基本情况</w:t>
+              <w:t/>
             </w:r>
             <w:r>
               <w:rPr>
@@ -7623,7 +7914,7 @@
                 <w:sz w:val="18"/>
                 <w:szCs w:val="18"/>
               </w:rPr>
-              <w:t>.</w:t>
+              <w:t/>
             </w:r>
             <w:r>
               <w:rPr>
@@ -7632,7 +7923,7 @@
                 <w:sz w:val="18"/>
                 <w:szCs w:val="18"/>
               </w:rPr>
-              <w:t>项目公司_手续</w:t>
+              <w:t/>
             </w:r>
             <w:r>
               <w:rPr>
@@ -7641,7 +7932,7 @@
                 <w:sz w:val="18"/>
                 <w:szCs w:val="18"/>
               </w:rPr>
-              <w:t>%}</w:t>
+              <w:t/>
             </w:r>
           </w:p>
         </w:tc>
@@ -7865,9 +8156,20 @@
             <w:vAlign w:val="center"/>
           </w:tcPr>
           <w:p>
-            <w:r>
-              <w:t>{%tc for p in 项目基本情况.项目公司_手续%}</w:t>
-            </w:r>
+            <w:pPr>
+              <w:tabs>
+                <w:tab w:val="left" w:pos="196"/>
+                <w:tab w:val="left" w:pos="426"/>
+              </w:tabs>
+              <w:snapToGrid w:val="0"/>
+              <w:spacing w:line="240" w:lineRule="auto"/>
+              <w:jc w:val="right"/>
+              <w:rPr>
+                <w:b/>
+                <w:sz w:val="18"/>
+                <w:szCs w:val="18"/>
+              </w:rPr>
+            </w:pPr>
           </w:p>
         </w:tc>
         <w:tc>
@@ -7876,10 +8178,20 @@
             <w:vAlign w:val="center"/>
           </w:tcPr>
           <w:p>
-            <w:r/>
-            <w:r>
-              <w:t>{{ p.手续_R01 }}</w:t>
-            </w:r>
+            <w:pPr>
+              <w:tabs>
+                <w:tab w:val="left" w:pos="196"/>
+                <w:tab w:val="left" w:pos="426"/>
+              </w:tabs>
+              <w:snapToGrid w:val="0"/>
+              <w:spacing w:line="240" w:lineRule="auto"/>
+              <w:jc w:val="right"/>
+              <w:rPr>
+                <w:b/>
+                <w:sz w:val="18"/>
+                <w:szCs w:val="18"/>
+              </w:rPr>
+            </w:pPr>
           </w:p>
         </w:tc>
         <w:tc>
@@ -7887,9 +8199,20 @@
             <w:tcW w:w="833" w:type="pct"/>
           </w:tcPr>
           <w:p>
-            <w:r>
-              <w:t>{%tc endfor%}</w:t>
-            </w:r>
+            <w:pPr>
+              <w:tabs>
+                <w:tab w:val="left" w:pos="196"/>
+                <w:tab w:val="left" w:pos="426"/>
+              </w:tabs>
+              <w:snapToGrid w:val="0"/>
+              <w:spacing w:line="240" w:lineRule="auto"/>
+              <w:jc w:val="right"/>
+              <w:rPr>
+                <w:b/>
+                <w:sz w:val="18"/>
+                <w:szCs w:val="18"/>
+              </w:rPr>
+            </w:pPr>
           </w:p>
         </w:tc>
       </w:tr>
@@ -7962,8 +8285,25 @@
             <w:vAlign w:val="center"/>
           </w:tcPr>
           <w:p>
-            <w:r>
-              <w:t>{%tc for p in 项目基本情况.项目公司_手续%}</w:t>
+            <w:pPr>
+              <w:tabs>
+                <w:tab w:val="left" w:pos="196"/>
+                <w:tab w:val="left" w:pos="426"/>
+              </w:tabs>
+              <w:snapToGrid w:val="0"/>
+              <w:spacing w:line="240" w:lineRule="auto"/>
+              <w:jc w:val="left"/>
+              <w:rPr>
+                <w:sz w:val="18"/>
+                <w:szCs w:val="18"/>
+              </w:rPr>
+            </w:pPr>
+            <w:r>
+              <w:rPr>
+                <w:sz w:val="18"/>
+                <w:szCs w:val="18"/>
+              </w:rPr>
+              <w:t>{{ i.备案文件 }}</w:t>
             </w:r>
           </w:p>
         </w:tc>
@@ -7973,9 +8313,25 @@
             <w:vAlign w:val="center"/>
           </w:tcPr>
           <w:p>
-            <w:r/>
-            <w:r>
-              <w:t>{{ p.手续_R02 }}</w:t>
+            <w:pPr>
+              <w:tabs>
+                <w:tab w:val="left" w:pos="196"/>
+                <w:tab w:val="left" w:pos="426"/>
+              </w:tabs>
+              <w:snapToGrid w:val="0"/>
+              <w:spacing w:line="240" w:lineRule="auto"/>
+              <w:jc w:val="left"/>
+              <w:rPr>
+                <w:sz w:val="18"/>
+                <w:szCs w:val="18"/>
+              </w:rPr>
+            </w:pPr>
+            <w:r>
+              <w:rPr>
+                <w:sz w:val="18"/>
+                <w:szCs w:val="18"/>
+              </w:rPr>
+              <w:t>{{ i.备案文件 }}</w:t>
             </w:r>
           </w:p>
         </w:tc>
@@ -7985,18 +8341,26 @@
             <w:vAlign w:val="center"/>
           </w:tcPr>
           <w:p>
-            <w:r>
-              <w:t>{%tc endfor%}</w:t>
-            </w:r>
-          </w:p>
-        </w:tc>
-        <w:tc>
-          <w:tcPr>
-            <w:tcW w:w="834" w:type="pct"/>
-            <w:vAlign w:val="center"/>
-          </w:tcPr>
-          <w:p>
-            <w:r/>
+            <w:pPr>
+              <w:tabs>
+                <w:tab w:val="left" w:pos="196"/>
+                <w:tab w:val="left" w:pos="426"/>
+              </w:tabs>
+              <w:snapToGrid w:val="0"/>
+              <w:spacing w:line="240" w:lineRule="auto"/>
+              <w:jc w:val="left"/>
+              <w:rPr>
+                <w:sz w:val="18"/>
+                <w:szCs w:val="18"/>
+              </w:rPr>
+            </w:pPr>
+            <w:r>
+              <w:rPr>
+                <w:sz w:val="18"/>
+                <w:szCs w:val="18"/>
+              </w:rPr>
+              <w:t>{{ i.备案文件 }}</w:t>
+            </w:r>
           </w:p>
         </w:tc>
       </w:tr>
@@ -8069,8 +8433,27 @@
             <w:vAlign w:val="center"/>
           </w:tcPr>
           <w:p>
-            <w:r>
-              <w:t>{%tc for p in 项目基本情况.项目公司_手续%}</w:t>
+            <w:pPr>
+              <w:tabs>
+                <w:tab w:val="left" w:pos="196"/>
+                <w:tab w:val="left" w:pos="426"/>
+              </w:tabs>
+              <w:snapToGrid w:val="0"/>
+              <w:spacing w:line="240" w:lineRule="auto"/>
+              <w:jc w:val="left"/>
+              <w:rPr>
+                <w:sz w:val="18"/>
+                <w:szCs w:val="18"/>
+              </w:rPr>
+            </w:pPr>
+            <w:r>
+              <w:rPr>
+                <w:color w:val="000000"/>
+                <w:kern w:val="0"/>
+                <w:sz w:val="18"/>
+                <w:szCs w:val="18"/>
+              </w:rPr>
+              <w:t>{{ i.接入电网审批 }}</w:t>
             </w:r>
           </w:p>
         </w:tc>
@@ -8080,9 +8463,29 @@
             <w:vAlign w:val="center"/>
           </w:tcPr>
           <w:p>
-            <w:r/>
-            <w:r>
-              <w:t>{{ p.手续_R03 }}</w:t>
+            <w:pPr>
+              <w:tabs>
+                <w:tab w:val="left" w:pos="196"/>
+                <w:tab w:val="left" w:pos="426"/>
+              </w:tabs>
+              <w:snapToGrid w:val="0"/>
+              <w:spacing w:line="240" w:lineRule="auto"/>
+              <w:jc w:val="left"/>
+              <w:rPr>
+                <w:color w:val="000000"/>
+                <w:kern w:val="0"/>
+                <w:sz w:val="18"/>
+                <w:szCs w:val="18"/>
+              </w:rPr>
+            </w:pPr>
+            <w:r>
+              <w:rPr>
+                <w:color w:val="000000"/>
+                <w:kern w:val="0"/>
+                <w:sz w:val="18"/>
+                <w:szCs w:val="18"/>
+              </w:rPr>
+              <w:t>{{ i.接入电网审批 }}</w:t>
             </w:r>
           </w:p>
         </w:tc>
@@ -8092,18 +8495,30 @@
             <w:vAlign w:val="center"/>
           </w:tcPr>
           <w:p>
-            <w:r>
-              <w:t>{%tc endfor%}</w:t>
-            </w:r>
-          </w:p>
-        </w:tc>
-        <w:tc>
-          <w:tcPr>
-            <w:tcW w:w="834" w:type="pct"/>
-            <w:vAlign w:val="center"/>
-          </w:tcPr>
-          <w:p>
-            <w:r/>
+            <w:pPr>
+              <w:tabs>
+                <w:tab w:val="left" w:pos="196"/>
+                <w:tab w:val="left" w:pos="426"/>
+              </w:tabs>
+              <w:snapToGrid w:val="0"/>
+              <w:spacing w:line="240" w:lineRule="auto"/>
+              <w:jc w:val="left"/>
+              <w:rPr>
+                <w:color w:val="000000"/>
+                <w:kern w:val="0"/>
+                <w:sz w:val="18"/>
+                <w:szCs w:val="18"/>
+              </w:rPr>
+            </w:pPr>
+            <w:r>
+              <w:rPr>
+                <w:color w:val="000000"/>
+                <w:kern w:val="0"/>
+                <w:sz w:val="18"/>
+                <w:szCs w:val="18"/>
+              </w:rPr>
+              <w:t>{{ i.接入电网审批 }}</w:t>
+            </w:r>
           </w:p>
         </w:tc>
       </w:tr>
@@ -8174,8 +8589,27 @@
             <w:vAlign w:val="center"/>
           </w:tcPr>
           <w:p>
-            <w:r>
-              <w:t>{%tc for p in 项目基本情况.项目公司_手续%}</w:t>
+            <w:pPr>
+              <w:tabs>
+                <w:tab w:val="left" w:pos="196"/>
+                <w:tab w:val="left" w:pos="426"/>
+              </w:tabs>
+              <w:snapToGrid w:val="0"/>
+              <w:spacing w:line="240" w:lineRule="auto"/>
+              <w:jc w:val="left"/>
+              <w:rPr>
+                <w:sz w:val="18"/>
+                <w:szCs w:val="18"/>
+              </w:rPr>
+            </w:pPr>
+            <w:r>
+              <w:rPr>
+                <w:color w:val="000000"/>
+                <w:kern w:val="0"/>
+                <w:sz w:val="18"/>
+                <w:szCs w:val="18"/>
+              </w:rPr>
+              <w:t>{{ i.环评文件 }}</w:t>
             </w:r>
           </w:p>
         </w:tc>
@@ -8185,9 +8619,29 @@
             <w:vAlign w:val="center"/>
           </w:tcPr>
           <w:p>
-            <w:r/>
-            <w:r>
-              <w:t>{{ p.手续_R04 }}</w:t>
+            <w:pPr>
+              <w:tabs>
+                <w:tab w:val="left" w:pos="196"/>
+                <w:tab w:val="left" w:pos="426"/>
+              </w:tabs>
+              <w:snapToGrid w:val="0"/>
+              <w:spacing w:line="240" w:lineRule="auto"/>
+              <w:jc w:val="left"/>
+              <w:rPr>
+                <w:color w:val="000000"/>
+                <w:kern w:val="0"/>
+                <w:sz w:val="18"/>
+                <w:szCs w:val="18"/>
+              </w:rPr>
+            </w:pPr>
+            <w:r>
+              <w:rPr>
+                <w:color w:val="000000"/>
+                <w:kern w:val="0"/>
+                <w:sz w:val="18"/>
+                <w:szCs w:val="18"/>
+              </w:rPr>
+              <w:t>{{ i.环评文件 }}</w:t>
             </w:r>
           </w:p>
         </w:tc>
@@ -8197,18 +8651,30 @@
             <w:vAlign w:val="center"/>
           </w:tcPr>
           <w:p>
-            <w:r>
-              <w:t>{%tc endfor%}</w:t>
-            </w:r>
-          </w:p>
-        </w:tc>
-        <w:tc>
-          <w:tcPr>
-            <w:tcW w:w="834" w:type="pct"/>
-            <w:vAlign w:val="center"/>
-          </w:tcPr>
-          <w:p>
-            <w:r/>
+            <w:pPr>
+              <w:tabs>
+                <w:tab w:val="left" w:pos="196"/>
+                <w:tab w:val="left" w:pos="426"/>
+              </w:tabs>
+              <w:snapToGrid w:val="0"/>
+              <w:spacing w:line="240" w:lineRule="auto"/>
+              <w:jc w:val="left"/>
+              <w:rPr>
+                <w:color w:val="000000"/>
+                <w:kern w:val="0"/>
+                <w:sz w:val="18"/>
+                <w:szCs w:val="18"/>
+              </w:rPr>
+            </w:pPr>
+            <w:r>
+              <w:rPr>
+                <w:color w:val="000000"/>
+                <w:kern w:val="0"/>
+                <w:sz w:val="18"/>
+                <w:szCs w:val="18"/>
+              </w:rPr>
+              <w:t>{{ i.环评文件 }}</w:t>
+            </w:r>
           </w:p>
         </w:tc>
       </w:tr>
@@ -8293,9 +8759,21 @@
             <w:vAlign w:val="center"/>
           </w:tcPr>
           <w:p>
-            <w:r>
-              <w:t>{%tc for p in 项目基本情况.项目公司_手续%}</w:t>
-            </w:r>
+            <w:pPr>
+              <w:tabs>
+                <w:tab w:val="left" w:pos="196"/>
+                <w:tab w:val="left" w:pos="426"/>
+              </w:tabs>
+              <w:snapToGrid w:val="0"/>
+              <w:spacing w:line="240" w:lineRule="auto"/>
+              <w:jc w:val="left"/>
+              <w:rPr>
+                <w:b/>
+                <w:bCs/>
+                <w:sz w:val="18"/>
+                <w:szCs w:val="18"/>
+              </w:rPr>
+            </w:pPr>
           </w:p>
         </w:tc>
         <w:tc>
@@ -8304,10 +8782,21 @@
             <w:vAlign w:val="center"/>
           </w:tcPr>
           <w:p>
-            <w:r/>
-            <w:r>
-              <w:t>{{ p.手续_R05 }}</w:t>
-            </w:r>
+            <w:pPr>
+              <w:tabs>
+                <w:tab w:val="left" w:pos="196"/>
+                <w:tab w:val="left" w:pos="426"/>
+              </w:tabs>
+              <w:snapToGrid w:val="0"/>
+              <w:spacing w:line="240" w:lineRule="auto"/>
+              <w:jc w:val="left"/>
+              <w:rPr>
+                <w:b/>
+                <w:bCs/>
+                <w:sz w:val="18"/>
+                <w:szCs w:val="18"/>
+              </w:rPr>
+            </w:pPr>
           </w:p>
         </w:tc>
         <w:tc>
@@ -8316,18 +8805,21 @@
             <w:vAlign w:val="center"/>
           </w:tcPr>
           <w:p>
-            <w:r>
-              <w:t>{%tc endfor%}</w:t>
-            </w:r>
-          </w:p>
-        </w:tc>
-        <w:tc>
-          <w:tcPr>
-            <w:tcW w:w="834" w:type="pct"/>
-            <w:vAlign w:val="center"/>
-          </w:tcPr>
-          <w:p>
-            <w:r/>
+            <w:pPr>
+              <w:tabs>
+                <w:tab w:val="left" w:pos="196"/>
+                <w:tab w:val="left" w:pos="426"/>
+              </w:tabs>
+              <w:snapToGrid w:val="0"/>
+              <w:spacing w:line="240" w:lineRule="auto"/>
+              <w:jc w:val="left"/>
+              <w:rPr>
+                <w:b/>
+                <w:bCs/>
+                <w:sz w:val="18"/>
+                <w:szCs w:val="18"/>
+              </w:rPr>
+            </w:pPr>
           </w:p>
         </w:tc>
       </w:tr>
@@ -8404,8 +8896,27 @@
             <w:vAlign w:val="center"/>
           </w:tcPr>
           <w:p>
-            <w:r>
-              <w:t>{%tc for p in 项目基本情况.项目公司_手续%}</w:t>
+            <w:pPr>
+              <w:tabs>
+                <w:tab w:val="left" w:pos="196"/>
+                <w:tab w:val="left" w:pos="426"/>
+              </w:tabs>
+              <w:snapToGrid w:val="0"/>
+              <w:spacing w:line="240" w:lineRule="auto"/>
+              <w:jc w:val="left"/>
+              <w:rPr>
+                <w:sz w:val="18"/>
+                <w:szCs w:val="18"/>
+              </w:rPr>
+            </w:pPr>
+            <w:r>
+              <w:rPr>
+                <w:color w:val="000000"/>
+                <w:kern w:val="0"/>
+                <w:sz w:val="18"/>
+                <w:szCs w:val="18"/>
+              </w:rPr>
+              <w:t>{{ i.房屋鉴定 }}</w:t>
             </w:r>
           </w:p>
         </w:tc>
@@ -8415,9 +8926,29 @@
             <w:vAlign w:val="center"/>
           </w:tcPr>
           <w:p>
-            <w:r/>
-            <w:r>
-              <w:t>{{ p.手续_R06 }}</w:t>
+            <w:pPr>
+              <w:tabs>
+                <w:tab w:val="left" w:pos="196"/>
+                <w:tab w:val="left" w:pos="426"/>
+              </w:tabs>
+              <w:snapToGrid w:val="0"/>
+              <w:spacing w:line="240" w:lineRule="auto"/>
+              <w:jc w:val="left"/>
+              <w:rPr>
+                <w:color w:val="000000"/>
+                <w:kern w:val="0"/>
+                <w:sz w:val="18"/>
+                <w:szCs w:val="18"/>
+              </w:rPr>
+            </w:pPr>
+            <w:r>
+              <w:rPr>
+                <w:color w:val="000000"/>
+                <w:kern w:val="0"/>
+                <w:sz w:val="18"/>
+                <w:szCs w:val="18"/>
+              </w:rPr>
+              <w:t>{{ i.房屋鉴定 }}</w:t>
             </w:r>
           </w:p>
         </w:tc>
@@ -8427,18 +8958,30 @@
             <w:vAlign w:val="center"/>
           </w:tcPr>
           <w:p>
-            <w:r>
-              <w:t>{%tc endfor%}</w:t>
-            </w:r>
-          </w:p>
-        </w:tc>
-        <w:tc>
-          <w:tcPr>
-            <w:tcW w:w="834" w:type="pct"/>
-            <w:vAlign w:val="center"/>
-          </w:tcPr>
-          <w:p>
-            <w:r/>
+            <w:pPr>
+              <w:tabs>
+                <w:tab w:val="left" w:pos="196"/>
+                <w:tab w:val="left" w:pos="426"/>
+              </w:tabs>
+              <w:snapToGrid w:val="0"/>
+              <w:spacing w:line="240" w:lineRule="auto"/>
+              <w:jc w:val="left"/>
+              <w:rPr>
+                <w:color w:val="000000"/>
+                <w:kern w:val="0"/>
+                <w:sz w:val="18"/>
+                <w:szCs w:val="18"/>
+              </w:rPr>
+            </w:pPr>
+            <w:r>
+              <w:rPr>
+                <w:color w:val="000000"/>
+                <w:kern w:val="0"/>
+                <w:sz w:val="18"/>
+                <w:szCs w:val="18"/>
+              </w:rPr>
+              <w:t>{{ i.房屋鉴定 }}</w:t>
+            </w:r>
           </w:p>
         </w:tc>
       </w:tr>
@@ -8515,8 +9058,27 @@
             <w:vAlign w:val="center"/>
           </w:tcPr>
           <w:p>
-            <w:r>
-              <w:t>{%tc for p in 项目基本情况.项目公司_手续%}</w:t>
+            <w:pPr>
+              <w:tabs>
+                <w:tab w:val="left" w:pos="196"/>
+                <w:tab w:val="left" w:pos="426"/>
+              </w:tabs>
+              <w:snapToGrid w:val="0"/>
+              <w:spacing w:line="240" w:lineRule="auto"/>
+              <w:jc w:val="left"/>
+              <w:rPr>
+                <w:color w:val="000000"/>
+                <w:kern w:val="0"/>
+                <w:sz w:val="18"/>
+                <w:szCs w:val="18"/>
+              </w:rPr>
+            </w:pPr>
+            <w:r>
+              <w:rPr>
+                <w:sz w:val="18"/>
+                <w:szCs w:val="18"/>
+              </w:rPr>
+              <w:t>{{ i.安全设计审查 }}</w:t>
             </w:r>
           </w:p>
         </w:tc>
@@ -8526,9 +9088,25 @@
             <w:vAlign w:val="center"/>
           </w:tcPr>
           <w:p>
-            <w:r/>
-            <w:r>
-              <w:t>{{ p.手续_R07 }}</w:t>
+            <w:pPr>
+              <w:tabs>
+                <w:tab w:val="left" w:pos="196"/>
+                <w:tab w:val="left" w:pos="426"/>
+              </w:tabs>
+              <w:snapToGrid w:val="0"/>
+              <w:spacing w:line="240" w:lineRule="auto"/>
+              <w:jc w:val="left"/>
+              <w:rPr>
+                <w:sz w:val="18"/>
+                <w:szCs w:val="18"/>
+              </w:rPr>
+            </w:pPr>
+            <w:r>
+              <w:rPr>
+                <w:sz w:val="18"/>
+                <w:szCs w:val="18"/>
+              </w:rPr>
+              <w:t>{{ i.安全设计审查 }}</w:t>
             </w:r>
           </w:p>
         </w:tc>
@@ -8538,18 +9116,26 @@
             <w:vAlign w:val="center"/>
           </w:tcPr>
           <w:p>
-            <w:r>
-              <w:t>{%tc endfor%}</w:t>
-            </w:r>
-          </w:p>
-        </w:tc>
-        <w:tc>
-          <w:tcPr>
-            <w:tcW w:w="834" w:type="pct"/>
-            <w:vAlign w:val="center"/>
-          </w:tcPr>
-          <w:p>
-            <w:r/>
+            <w:pPr>
+              <w:tabs>
+                <w:tab w:val="left" w:pos="196"/>
+                <w:tab w:val="left" w:pos="426"/>
+              </w:tabs>
+              <w:snapToGrid w:val="0"/>
+              <w:spacing w:line="240" w:lineRule="auto"/>
+              <w:jc w:val="left"/>
+              <w:rPr>
+                <w:sz w:val="18"/>
+                <w:szCs w:val="18"/>
+              </w:rPr>
+            </w:pPr>
+            <w:r>
+              <w:rPr>
+                <w:sz w:val="18"/>
+                <w:szCs w:val="18"/>
+              </w:rPr>
+              <w:t>{{ i.安全设计审查 }}</w:t>
+            </w:r>
           </w:p>
         </w:tc>
       </w:tr>
@@ -8626,8 +9212,29 @@
             <w:vAlign w:val="center"/>
           </w:tcPr>
           <w:p>
-            <w:r>
-              <w:t>{%tc for p in 项目基本情况.项目公司_手续%}</w:t>
+            <w:pPr>
+              <w:tabs>
+                <w:tab w:val="left" w:pos="196"/>
+                <w:tab w:val="left" w:pos="426"/>
+              </w:tabs>
+              <w:snapToGrid w:val="0"/>
+              <w:spacing w:line="240" w:lineRule="auto"/>
+              <w:jc w:val="left"/>
+              <w:rPr>
+                <w:color w:val="000000"/>
+                <w:kern w:val="0"/>
+                <w:sz w:val="18"/>
+                <w:szCs w:val="18"/>
+              </w:rPr>
+            </w:pPr>
+            <w:r>
+              <w:rPr>
+                <w:color w:val="000000"/>
+                <w:kern w:val="0"/>
+                <w:sz w:val="18"/>
+                <w:szCs w:val="18"/>
+              </w:rPr>
+              <w:t>{{ i.安全预评价 }}</w:t>
             </w:r>
           </w:p>
         </w:tc>
@@ -8637,9 +9244,29 @@
             <w:vAlign w:val="center"/>
           </w:tcPr>
           <w:p>
-            <w:r/>
-            <w:r>
-              <w:t>{{ p.手续_R08 }}</w:t>
+            <w:pPr>
+              <w:tabs>
+                <w:tab w:val="left" w:pos="196"/>
+                <w:tab w:val="left" w:pos="426"/>
+              </w:tabs>
+              <w:snapToGrid w:val="0"/>
+              <w:spacing w:line="240" w:lineRule="auto"/>
+              <w:jc w:val="left"/>
+              <w:rPr>
+                <w:color w:val="000000"/>
+                <w:kern w:val="0"/>
+                <w:sz w:val="18"/>
+                <w:szCs w:val="18"/>
+              </w:rPr>
+            </w:pPr>
+            <w:r>
+              <w:rPr>
+                <w:color w:val="000000"/>
+                <w:kern w:val="0"/>
+                <w:sz w:val="18"/>
+                <w:szCs w:val="18"/>
+              </w:rPr>
+              <w:t>{{ i.安全预评价 }}</w:t>
             </w:r>
           </w:p>
         </w:tc>
@@ -8649,18 +9276,30 @@
             <w:vAlign w:val="center"/>
           </w:tcPr>
           <w:p>
-            <w:r>
-              <w:t>{%tc endfor%}</w:t>
-            </w:r>
-          </w:p>
-        </w:tc>
-        <w:tc>
-          <w:tcPr>
-            <w:tcW w:w="834" w:type="pct"/>
-            <w:vAlign w:val="center"/>
-          </w:tcPr>
-          <w:p>
-            <w:r/>
+            <w:pPr>
+              <w:tabs>
+                <w:tab w:val="left" w:pos="196"/>
+                <w:tab w:val="left" w:pos="426"/>
+              </w:tabs>
+              <w:snapToGrid w:val="0"/>
+              <w:spacing w:line="240" w:lineRule="auto"/>
+              <w:jc w:val="left"/>
+              <w:rPr>
+                <w:color w:val="000000"/>
+                <w:kern w:val="0"/>
+                <w:sz w:val="18"/>
+                <w:szCs w:val="18"/>
+              </w:rPr>
+            </w:pPr>
+            <w:r>
+              <w:rPr>
+                <w:color w:val="000000"/>
+                <w:kern w:val="0"/>
+                <w:sz w:val="18"/>
+                <w:szCs w:val="18"/>
+              </w:rPr>
+              <w:t>{{ i.安全预评价 }}</w:t>
+            </w:r>
           </w:p>
         </w:tc>
       </w:tr>
@@ -8737,8 +9376,29 @@
             <w:vAlign w:val="center"/>
           </w:tcPr>
           <w:p>
-            <w:r>
-              <w:t>{%tc for p in 项目基本情况.项目公司_手续%}</w:t>
+            <w:pPr>
+              <w:tabs>
+                <w:tab w:val="left" w:pos="196"/>
+                <w:tab w:val="left" w:pos="426"/>
+              </w:tabs>
+              <w:snapToGrid w:val="0"/>
+              <w:spacing w:line="240" w:lineRule="auto"/>
+              <w:jc w:val="left"/>
+              <w:rPr>
+                <w:color w:val="000000"/>
+                <w:kern w:val="0"/>
+                <w:sz w:val="18"/>
+                <w:szCs w:val="18"/>
+              </w:rPr>
+            </w:pPr>
+            <w:r>
+              <w:rPr>
+                <w:color w:val="000000"/>
+                <w:kern w:val="0"/>
+                <w:sz w:val="18"/>
+                <w:szCs w:val="18"/>
+              </w:rPr>
+              <w:t>{{ i.消防备案 }}</w:t>
             </w:r>
           </w:p>
         </w:tc>
@@ -8748,9 +9408,29 @@
             <w:vAlign w:val="center"/>
           </w:tcPr>
           <w:p>
-            <w:r/>
-            <w:r>
-              <w:t>{{ p.手续_R09 }}</w:t>
+            <w:pPr>
+              <w:tabs>
+                <w:tab w:val="left" w:pos="196"/>
+                <w:tab w:val="left" w:pos="426"/>
+              </w:tabs>
+              <w:snapToGrid w:val="0"/>
+              <w:spacing w:line="240" w:lineRule="auto"/>
+              <w:jc w:val="left"/>
+              <w:rPr>
+                <w:color w:val="000000"/>
+                <w:kern w:val="0"/>
+                <w:sz w:val="18"/>
+                <w:szCs w:val="18"/>
+              </w:rPr>
+            </w:pPr>
+            <w:r>
+              <w:rPr>
+                <w:color w:val="000000"/>
+                <w:kern w:val="0"/>
+                <w:sz w:val="18"/>
+                <w:szCs w:val="18"/>
+              </w:rPr>
+              <w:t>{{ i.消防备案 }}</w:t>
             </w:r>
           </w:p>
         </w:tc>
@@ -8760,18 +9440,30 @@
             <w:vAlign w:val="center"/>
           </w:tcPr>
           <w:p>
-            <w:r>
-              <w:t>{%tc endfor%}</w:t>
-            </w:r>
-          </w:p>
-        </w:tc>
-        <w:tc>
-          <w:tcPr>
-            <w:tcW w:w="834" w:type="pct"/>
-            <w:vAlign w:val="center"/>
-          </w:tcPr>
-          <w:p>
-            <w:r/>
+            <w:pPr>
+              <w:tabs>
+                <w:tab w:val="left" w:pos="196"/>
+                <w:tab w:val="left" w:pos="426"/>
+              </w:tabs>
+              <w:snapToGrid w:val="0"/>
+              <w:spacing w:line="240" w:lineRule="auto"/>
+              <w:jc w:val="left"/>
+              <w:rPr>
+                <w:color w:val="000000"/>
+                <w:kern w:val="0"/>
+                <w:sz w:val="18"/>
+                <w:szCs w:val="18"/>
+              </w:rPr>
+            </w:pPr>
+            <w:r>
+              <w:rPr>
+                <w:color w:val="000000"/>
+                <w:kern w:val="0"/>
+                <w:sz w:val="18"/>
+                <w:szCs w:val="18"/>
+              </w:rPr>
+              <w:t>{{ i.消防备案 }}</w:t>
+            </w:r>
           </w:p>
         </w:tc>
       </w:tr>
@@ -8878,9 +9570,19 @@
             <w:vAlign w:val="center"/>
           </w:tcPr>
           <w:p>
-            <w:r>
-              <w:t>{%tc for p in 项目基本情况.项目公司_手续%}</w:t>
-            </w:r>
+            <w:pPr>
+              <w:tabs>
+                <w:tab w:val="left" w:pos="196"/>
+                <w:tab w:val="left" w:pos="426"/>
+              </w:tabs>
+              <w:snapToGrid w:val="0"/>
+              <w:spacing w:line="240" w:lineRule="auto"/>
+              <w:jc w:val="left"/>
+              <w:rPr>
+                <w:sz w:val="18"/>
+                <w:szCs w:val="18"/>
+              </w:rPr>
+            </w:pPr>
           </w:p>
         </w:tc>
         <w:tc>
@@ -8889,10 +9591,19 @@
             <w:vAlign w:val="center"/>
           </w:tcPr>
           <w:p>
-            <w:r/>
-            <w:r>
-              <w:t>{{ p.手续_R10 }}</w:t>
-            </w:r>
+            <w:pPr>
+              <w:tabs>
+                <w:tab w:val="left" w:pos="196"/>
+                <w:tab w:val="left" w:pos="426"/>
+              </w:tabs>
+              <w:snapToGrid w:val="0"/>
+              <w:spacing w:line="240" w:lineRule="auto"/>
+              <w:jc w:val="left"/>
+              <w:rPr>
+                <w:sz w:val="18"/>
+                <w:szCs w:val="18"/>
+              </w:rPr>
+            </w:pPr>
           </w:p>
         </w:tc>
         <w:tc>
@@ -8901,18 +9612,19 @@
             <w:vAlign w:val="center"/>
           </w:tcPr>
           <w:p>
-            <w:r>
-              <w:t>{%tc endfor%}</w:t>
-            </w:r>
-          </w:p>
-        </w:tc>
-        <w:tc>
-          <w:tcPr>
-            <w:tcW w:w="834" w:type="pct"/>
-            <w:vAlign w:val="center"/>
-          </w:tcPr>
-          <w:p>
-            <w:r/>
+            <w:pPr>
+              <w:tabs>
+                <w:tab w:val="left" w:pos="196"/>
+                <w:tab w:val="left" w:pos="426"/>
+              </w:tabs>
+              <w:snapToGrid w:val="0"/>
+              <w:spacing w:line="240" w:lineRule="auto"/>
+              <w:jc w:val="left"/>
+              <w:rPr>
+                <w:sz w:val="18"/>
+                <w:szCs w:val="18"/>
+              </w:rPr>
+            </w:pPr>
           </w:p>
         </w:tc>
       </w:tr>
@@ -8991,8 +9703,27 @@
             <w:vAlign w:val="center"/>
           </w:tcPr>
           <w:p>
-            <w:r>
-              <w:t>{%tc for p in 项目基本情况.项目公司_手续%}</w:t>
+            <w:pPr>
+              <w:tabs>
+                <w:tab w:val="left" w:pos="196"/>
+                <w:tab w:val="left" w:pos="426"/>
+              </w:tabs>
+              <w:snapToGrid w:val="0"/>
+              <w:spacing w:line="240" w:lineRule="auto"/>
+              <w:jc w:val="left"/>
+              <w:rPr>
+                <w:sz w:val="18"/>
+                <w:szCs w:val="18"/>
+              </w:rPr>
+            </w:pPr>
+            <w:r>
+              <w:rPr>
+                <w:color w:val="000000"/>
+                <w:kern w:val="0"/>
+                <w:sz w:val="18"/>
+                <w:szCs w:val="18"/>
+              </w:rPr>
+              <w:t>{{ i.购售电合同 }}</w:t>
             </w:r>
           </w:p>
         </w:tc>
@@ -9002,9 +9733,29 @@
             <w:vAlign w:val="center"/>
           </w:tcPr>
           <w:p>
-            <w:r/>
-            <w:r>
-              <w:t>{{ p.手续_R11 }}</w:t>
+            <w:pPr>
+              <w:tabs>
+                <w:tab w:val="left" w:pos="196"/>
+                <w:tab w:val="left" w:pos="426"/>
+              </w:tabs>
+              <w:snapToGrid w:val="0"/>
+              <w:spacing w:line="240" w:lineRule="auto"/>
+              <w:jc w:val="left"/>
+              <w:rPr>
+                <w:color w:val="000000"/>
+                <w:kern w:val="0"/>
+                <w:sz w:val="18"/>
+                <w:szCs w:val="18"/>
+              </w:rPr>
+            </w:pPr>
+            <w:r>
+              <w:rPr>
+                <w:color w:val="000000"/>
+                <w:kern w:val="0"/>
+                <w:sz w:val="18"/>
+                <w:szCs w:val="18"/>
+              </w:rPr>
+              <w:t>{{ i.购售电合同 }}</w:t>
             </w:r>
           </w:p>
         </w:tc>
@@ -9014,18 +9765,30 @@
             <w:vAlign w:val="center"/>
           </w:tcPr>
           <w:p>
-            <w:r>
-              <w:t>{%tc endfor%}</w:t>
-            </w:r>
-          </w:p>
-        </w:tc>
-        <w:tc>
-          <w:tcPr>
-            <w:tcW w:w="834" w:type="pct"/>
-            <w:vAlign w:val="center"/>
-          </w:tcPr>
-          <w:p>
-            <w:r/>
+            <w:pPr>
+              <w:tabs>
+                <w:tab w:val="left" w:pos="196"/>
+                <w:tab w:val="left" w:pos="426"/>
+              </w:tabs>
+              <w:snapToGrid w:val="0"/>
+              <w:spacing w:line="240" w:lineRule="auto"/>
+              <w:jc w:val="left"/>
+              <w:rPr>
+                <w:color w:val="000000"/>
+                <w:kern w:val="0"/>
+                <w:sz w:val="18"/>
+                <w:szCs w:val="18"/>
+              </w:rPr>
+            </w:pPr>
+            <w:r>
+              <w:rPr>
+                <w:color w:val="000000"/>
+                <w:kern w:val="0"/>
+                <w:sz w:val="18"/>
+                <w:szCs w:val="18"/>
+              </w:rPr>
+              <w:t>{{ i.购售电合同 }}</w:t>
+            </w:r>
           </w:p>
         </w:tc>
       </w:tr>
@@ -9102,8 +9865,27 @@
             <w:vAlign w:val="center"/>
           </w:tcPr>
           <w:p>
-            <w:r>
-              <w:t>{%tc for p in 项目基本情况.项目公司_手续%}</w:t>
+            <w:pPr>
+              <w:tabs>
+                <w:tab w:val="left" w:pos="196"/>
+                <w:tab w:val="left" w:pos="426"/>
+              </w:tabs>
+              <w:snapToGrid w:val="0"/>
+              <w:spacing w:line="240" w:lineRule="auto"/>
+              <w:jc w:val="left"/>
+              <w:rPr>
+                <w:sz w:val="18"/>
+                <w:szCs w:val="18"/>
+              </w:rPr>
+            </w:pPr>
+            <w:r>
+              <w:rPr>
+                <w:color w:val="000000"/>
+                <w:kern w:val="0"/>
+                <w:sz w:val="18"/>
+                <w:szCs w:val="18"/>
+              </w:rPr>
+              <w:t>{{ i.并网验收 }}</w:t>
             </w:r>
           </w:p>
         </w:tc>
@@ -9113,9 +9895,29 @@
             <w:vAlign w:val="center"/>
           </w:tcPr>
           <w:p>
-            <w:r/>
-            <w:r>
-              <w:t>{{ p.手续_R12 }}</w:t>
+            <w:pPr>
+              <w:tabs>
+                <w:tab w:val="left" w:pos="196"/>
+                <w:tab w:val="left" w:pos="426"/>
+              </w:tabs>
+              <w:snapToGrid w:val="0"/>
+              <w:spacing w:line="240" w:lineRule="auto"/>
+              <w:jc w:val="left"/>
+              <w:rPr>
+                <w:color w:val="000000"/>
+                <w:kern w:val="0"/>
+                <w:sz w:val="18"/>
+                <w:szCs w:val="18"/>
+              </w:rPr>
+            </w:pPr>
+            <w:r>
+              <w:rPr>
+                <w:color w:val="000000"/>
+                <w:kern w:val="0"/>
+                <w:sz w:val="18"/>
+                <w:szCs w:val="18"/>
+              </w:rPr>
+              <w:t>{{ i.并网验收 }}</w:t>
             </w:r>
           </w:p>
         </w:tc>
@@ -9125,18 +9927,30 @@
             <w:vAlign w:val="center"/>
           </w:tcPr>
           <w:p>
-            <w:r>
-              <w:t>{%tc endfor%}</w:t>
-            </w:r>
-          </w:p>
-        </w:tc>
-        <w:tc>
-          <w:tcPr>
-            <w:tcW w:w="834" w:type="pct"/>
-            <w:vAlign w:val="center"/>
-          </w:tcPr>
-          <w:p>
-            <w:r/>
+            <w:pPr>
+              <w:tabs>
+                <w:tab w:val="left" w:pos="196"/>
+                <w:tab w:val="left" w:pos="426"/>
+              </w:tabs>
+              <w:snapToGrid w:val="0"/>
+              <w:spacing w:line="240" w:lineRule="auto"/>
+              <w:jc w:val="left"/>
+              <w:rPr>
+                <w:color w:val="000000"/>
+                <w:kern w:val="0"/>
+                <w:sz w:val="18"/>
+                <w:szCs w:val="18"/>
+              </w:rPr>
+            </w:pPr>
+            <w:r>
+              <w:rPr>
+                <w:color w:val="000000"/>
+                <w:kern w:val="0"/>
+                <w:sz w:val="18"/>
+                <w:szCs w:val="18"/>
+              </w:rPr>
+              <w:t>{{ i.并网验收 }}</w:t>
+            </w:r>
           </w:p>
         </w:tc>
       </w:tr>

</xml_diff>